<commit_message>
Update all project documents
</commit_message>
<xml_diff>
--- a/docs/ETL Pipeline for Financial Risk Data (BRS).docx
+++ b/docs/ETL Pipeline for Financial Risk Data (BRS).docx
@@ -27,54 +27,65 @@
     <w:p>
       <w:pPr>
         <w:spacing w:before="100" w:beforeAutospacing="1" w:after="100" w:afterAutospacing="1" w:line="240" w:lineRule="auto"/>
-        <w:outlineLvl w:val="1"/>
+        <w:rPr>
+          <w:rFonts w:ascii="PMingLiU" w:eastAsia="PMingLiU" w:hAnsi="PMingLiU" w:cs="PMingLiU"/>
+          <w:sz w:val="24"/>
+          <w:szCs w:val="24"/>
+          <w:lang w:eastAsia="zh-TW"/>
+        </w:rPr>
+      </w:pPr>
+      <w:r>
+        <w:rPr>
+          <w:rFonts w:ascii="Segoe UI Symbol" w:eastAsia="PMingLiU" w:hAnsi="Segoe UI Symbol" w:cs="Segoe UI Symbol"/>
+          <w:sz w:val="24"/>
+          <w:szCs w:val="24"/>
+          <w:lang w:eastAsia="zh-TW"/>
+        </w:rPr>
+        <w:t>📑</w:t>
+      </w:r>
+      <w:r>
+        <w:rPr>
+          <w:rFonts w:ascii="PMingLiU" w:eastAsia="PMingLiU" w:hAnsi="PMingLiU" w:cs="PMingLiU"/>
+          <w:sz w:val="24"/>
+          <w:szCs w:val="24"/>
+          <w:lang w:eastAsia="zh-TW"/>
+        </w:rPr>
+        <w:t xml:space="preserve"> </w:t>
+      </w:r>
+      <w:r>
         <w:rPr>
           <w:rFonts w:ascii="PMingLiU" w:eastAsia="PMingLiU" w:hAnsi="PMingLiU" w:cs="PMingLiU"/>
           <w:b/>
           <w:bCs/>
-          <w:sz w:val="36"/>
-          <w:szCs w:val="36"/>
-          <w:lang w:eastAsia="zh-TW"/>
-        </w:rPr>
-      </w:pPr>
-      <w:r>
-        <w:rPr>
-          <w:rFonts w:ascii="Segoe UI Symbol" w:eastAsia="PMingLiU" w:hAnsi="Segoe UI Symbol" w:cs="Segoe UI Symbol"/>
+          <w:sz w:val="24"/>
+          <w:szCs w:val="24"/>
+          <w:lang w:eastAsia="zh-TW"/>
+        </w:rPr>
+        <w:t>Business Requirement Specification (BRS)</w:t>
+      </w:r>
+      <w:r>
+        <w:rPr>
+          <w:rFonts w:ascii="PMingLiU" w:eastAsia="PMingLiU" w:hAnsi="PMingLiU" w:cs="PMingLiU"/>
+          <w:sz w:val="24"/>
+          <w:szCs w:val="24"/>
+          <w:lang w:eastAsia="zh-TW"/>
+        </w:rPr>
+        <w:t xml:space="preserve"> </w:t>
+      </w:r>
+      <w:r>
+        <w:rPr>
+          <w:rFonts w:ascii="PMingLiU" w:eastAsia="PMingLiU" w:hAnsi="PMingLiU" w:cs="PMingLiU"/>
+          <w:sz w:val="24"/>
+          <w:szCs w:val="24"/>
+          <w:lang w:eastAsia="zh-TW"/>
+        </w:rPr>
+        <w:br/>
+      </w:r>
+      <w:r>
+        <w:rPr>
+          <w:rFonts w:ascii="PMingLiU" w:eastAsia="PMingLiU" w:hAnsi="PMingLiU" w:cs="PMingLiU"/>
           <w:b/>
           <w:bCs/>
-          <w:sz w:val="36"/>
-          <w:szCs w:val="36"/>
-          <w:lang w:eastAsia="zh-TW"/>
-        </w:rPr>
-        <w:t>📑</w:t>
-      </w:r>
-      <w:r>
-        <w:rPr>
-          <w:rFonts w:ascii="PMingLiU" w:eastAsia="PMingLiU" w:hAnsi="PMingLiU" w:cs="PMingLiU"/>
-          <w:b/>
-          <w:bCs/>
-          <w:sz w:val="36"/>
-          <w:szCs w:val="36"/>
-          <w:lang w:eastAsia="zh-TW"/>
-        </w:rPr>
-        <w:t xml:space="preserve"> Business Requirement Specification (BRS)</w:t>
-      </w:r>
-    </w:p>
-    <w:p>
-      <w:pPr>
-        <w:spacing w:before="100" w:beforeAutospacing="1" w:after="100" w:afterAutospacing="1" w:line="240" w:lineRule="auto"/>
-        <w:rPr>
-          <w:rFonts w:ascii="PMingLiU" w:eastAsia="PMingLiU" w:hAnsi="PMingLiU" w:cs="PMingLiU"/>
-          <w:sz w:val="24"/>
-          <w:szCs w:val="24"/>
-          <w:lang w:eastAsia="zh-TW"/>
-        </w:rPr>
-      </w:pPr>
-      <w:r>
-        <w:rPr>
-          <w:rFonts w:ascii="PMingLiU" w:eastAsia="PMingLiU" w:hAnsi="PMingLiU" w:cs="PMingLiU"/>
-          <w:b/>
-          <w:bCs/>
           <w:sz w:val="24"/>
           <w:szCs w:val="24"/>
           <w:lang w:eastAsia="zh-TW"/>
@@ -88,7 +99,16 @@
           <w:szCs w:val="24"/>
           <w:lang w:eastAsia="zh-TW"/>
         </w:rPr>
-        <w:t>: ETL Pipeline for Financial Risk Data</w:t>
+        <w:t xml:space="preserve">: </w:t>
+      </w:r>
+      <w:r>
+        <w:rPr>
+          <w:rFonts w:ascii="PMingLiU" w:eastAsia="PMingLiU" w:hAnsi="PMingLiU" w:cs="PMingLiU"/>
+          <w:sz w:val="24"/>
+          <w:szCs w:val="24"/>
+          <w:lang w:eastAsia="zh-TW"/>
+        </w:rPr>
+        <w:t>ETL Pipeline with Data Quality Implementation on Finance</w:t>
       </w:r>
       <w:r>
         <w:rPr>
@@ -164,14 +184,14 @@
           <w:szCs w:val="27"/>
           <w:lang w:eastAsia="zh-TW"/>
         </w:rPr>
-        <w:t>1. Business Requirements (Implementable)</w:t>
+        <w:t>1. Business Requirements</w:t>
       </w:r>
     </w:p>
     <w:p>
       <w:pPr>
         <w:numPr>
           <w:ilvl w:val="0"/>
-          <w:numId w:val="3"/>
+          <w:numId w:val="9"/>
         </w:numPr>
         <w:spacing w:before="100" w:beforeAutospacing="1" w:after="100" w:afterAutospacing="1" w:line="240" w:lineRule="auto"/>
         <w:rPr>
@@ -184,22 +204,11 @@
       <w:r>
         <w:rPr>
           <w:rFonts w:ascii="PMingLiU" w:eastAsia="PMingLiU" w:hAnsi="PMingLiU" w:cs="PMingLiU"/>
-          <w:b/>
-          <w:bCs/>
-          <w:sz w:val="24"/>
-          <w:szCs w:val="24"/>
-          <w:lang w:eastAsia="zh-TW"/>
-        </w:rPr>
-        <w:t>BR1</w:t>
-      </w:r>
-      <w:r>
-        <w:rPr>
-          <w:rFonts w:ascii="PMingLiU" w:eastAsia="PMingLiU" w:hAnsi="PMingLiU" w:cs="PMingLiU"/>
-          <w:sz w:val="24"/>
-          <w:szCs w:val="24"/>
-          <w:lang w:eastAsia="zh-TW"/>
-        </w:rPr>
-        <w:t xml:space="preserve">: Build an ETL pipeline to consolidate raw risk data from multiple sources (CSV, SQL, </w:t>
+          <w:sz w:val="24"/>
+          <w:szCs w:val="24"/>
+          <w:lang w:eastAsia="zh-TW"/>
+        </w:rPr>
+        <w:t xml:space="preserve">BR1: Build an ETL pipeline to consolidate raw risk data from multiple sources (CSV, SQL, </w:t>
       </w:r>
       <w:proofErr w:type="gramStart"/>
       <w:r>
@@ -226,7 +235,7 @@
       <w:pPr>
         <w:numPr>
           <w:ilvl w:val="0"/>
-          <w:numId w:val="3"/>
+          <w:numId w:val="9"/>
         </w:numPr>
         <w:spacing w:before="100" w:beforeAutospacing="1" w:after="100" w:afterAutospacing="1" w:line="240" w:lineRule="auto"/>
         <w:rPr>
@@ -239,29 +248,18 @@
       <w:r>
         <w:rPr>
           <w:rFonts w:ascii="PMingLiU" w:eastAsia="PMingLiU" w:hAnsi="PMingLiU" w:cs="PMingLiU"/>
-          <w:b/>
-          <w:bCs/>
-          <w:sz w:val="24"/>
-          <w:szCs w:val="24"/>
-          <w:lang w:eastAsia="zh-TW"/>
-        </w:rPr>
-        <w:t>BR2</w:t>
-      </w:r>
-      <w:r>
-        <w:rPr>
-          <w:rFonts w:ascii="PMingLiU" w:eastAsia="PMingLiU" w:hAnsi="PMingLiU" w:cs="PMingLiU"/>
-          <w:sz w:val="24"/>
-          <w:szCs w:val="24"/>
-          <w:lang w:eastAsia="zh-TW"/>
-        </w:rPr>
-        <w:t>: Automate Basel III ratio calculations (LCR, NSFR, CET1, leverage).</w:t>
+          <w:sz w:val="24"/>
+          <w:szCs w:val="24"/>
+          <w:lang w:eastAsia="zh-TW"/>
+        </w:rPr>
+        <w:t>BR2: Automate Basel III ratio calculations (LCR, NSFR, CET1, leverage).</w:t>
       </w:r>
     </w:p>
     <w:p>
       <w:pPr>
         <w:numPr>
           <w:ilvl w:val="0"/>
-          <w:numId w:val="3"/>
+          <w:numId w:val="9"/>
         </w:numPr>
         <w:spacing w:before="100" w:beforeAutospacing="1" w:after="100" w:afterAutospacing="1" w:line="240" w:lineRule="auto"/>
         <w:rPr>
@@ -274,29 +272,18 @@
       <w:r>
         <w:rPr>
           <w:rFonts w:ascii="PMingLiU" w:eastAsia="PMingLiU" w:hAnsi="PMingLiU" w:cs="PMingLiU"/>
-          <w:b/>
-          <w:bCs/>
-          <w:sz w:val="24"/>
-          <w:szCs w:val="24"/>
-          <w:lang w:eastAsia="zh-TW"/>
-        </w:rPr>
-        <w:t>BR3</w:t>
-      </w:r>
-      <w:r>
-        <w:rPr>
-          <w:rFonts w:ascii="PMingLiU" w:eastAsia="PMingLiU" w:hAnsi="PMingLiU" w:cs="PMingLiU"/>
-          <w:sz w:val="24"/>
-          <w:szCs w:val="24"/>
-          <w:lang w:eastAsia="zh-TW"/>
-        </w:rPr>
-        <w:t>: Ensure accuracy and consistency of ratio outputs through data cleaning and normalization.</w:t>
+          <w:sz w:val="24"/>
+          <w:szCs w:val="24"/>
+          <w:lang w:eastAsia="zh-TW"/>
+        </w:rPr>
+        <w:t>BR3: Ensure accuracy and consistency of ratio outputs through data cleaning and normalization.</w:t>
       </w:r>
     </w:p>
     <w:p>
       <w:pPr>
         <w:numPr>
           <w:ilvl w:val="0"/>
-          <w:numId w:val="3"/>
+          <w:numId w:val="9"/>
         </w:numPr>
         <w:spacing w:before="100" w:beforeAutospacing="1" w:after="100" w:afterAutospacing="1" w:line="240" w:lineRule="auto"/>
         <w:rPr>
@@ -309,29 +296,18 @@
       <w:r>
         <w:rPr>
           <w:rFonts w:ascii="PMingLiU" w:eastAsia="PMingLiU" w:hAnsi="PMingLiU" w:cs="PMingLiU"/>
-          <w:b/>
-          <w:bCs/>
-          <w:sz w:val="24"/>
-          <w:szCs w:val="24"/>
-          <w:lang w:eastAsia="zh-TW"/>
-        </w:rPr>
-        <w:t>BR4</w:t>
-      </w:r>
-      <w:r>
-        <w:rPr>
-          <w:rFonts w:ascii="PMingLiU" w:eastAsia="PMingLiU" w:hAnsi="PMingLiU" w:cs="PMingLiU"/>
-          <w:sz w:val="24"/>
-          <w:szCs w:val="24"/>
-          <w:lang w:eastAsia="zh-TW"/>
-        </w:rPr>
-        <w:t>: Provide transparency with logs and lineage from raw data to dashboard.</w:t>
+          <w:sz w:val="24"/>
+          <w:szCs w:val="24"/>
+          <w:lang w:eastAsia="zh-TW"/>
+        </w:rPr>
+        <w:t>BR4: Provide transparency with logs and lineage from raw data to dashboard.</w:t>
       </w:r>
     </w:p>
     <w:p>
       <w:pPr>
         <w:numPr>
           <w:ilvl w:val="0"/>
-          <w:numId w:val="3"/>
+          <w:numId w:val="9"/>
         </w:numPr>
         <w:spacing w:before="100" w:beforeAutospacing="1" w:after="100" w:afterAutospacing="1" w:line="240" w:lineRule="auto"/>
         <w:rPr>
@@ -344,22 +320,11 @@
       <w:r>
         <w:rPr>
           <w:rFonts w:ascii="PMingLiU" w:eastAsia="PMingLiU" w:hAnsi="PMingLiU" w:cs="PMingLiU"/>
-          <w:b/>
-          <w:bCs/>
-          <w:sz w:val="24"/>
-          <w:szCs w:val="24"/>
-          <w:lang w:eastAsia="zh-TW"/>
-        </w:rPr>
-        <w:t>BR5</w:t>
-      </w:r>
-      <w:r>
-        <w:rPr>
-          <w:rFonts w:ascii="PMingLiU" w:eastAsia="PMingLiU" w:hAnsi="PMingLiU" w:cs="PMingLiU"/>
-          <w:sz w:val="24"/>
-          <w:szCs w:val="24"/>
-          <w:lang w:eastAsia="zh-TW"/>
-        </w:rPr>
-        <w:t>: Deliver user</w:t>
+          <w:sz w:val="24"/>
+          <w:szCs w:val="24"/>
+          <w:lang w:eastAsia="zh-TW"/>
+        </w:rPr>
+        <w:t>BR5: Deliver user</w:t>
       </w:r>
       <w:r>
         <w:rPr>
@@ -369,24 +334,14 @@
           <w:lang w:eastAsia="zh-TW"/>
         </w:rPr>
         <w:noBreakHyphen/>
-        <w:t>friendly demo outputs via a dashboard with traffic</w:t>
-      </w:r>
-      <w:r>
-        <w:rPr>
-          <w:rFonts w:ascii="PMingLiU" w:eastAsia="PMingLiU" w:hAnsi="PMingLiU" w:cs="PMingLiU"/>
-          <w:sz w:val="24"/>
-          <w:szCs w:val="24"/>
-          <w:lang w:eastAsia="zh-TW"/>
-        </w:rPr>
-        <w:noBreakHyphen/>
-        <w:t>light indicators and trend charts.</w:t>
+        <w:t>friendly demo outputs via a dashboard with trend charts.</w:t>
       </w:r>
     </w:p>
     <w:p>
       <w:pPr>
         <w:numPr>
           <w:ilvl w:val="0"/>
-          <w:numId w:val="3"/>
+          <w:numId w:val="9"/>
         </w:numPr>
         <w:spacing w:before="100" w:beforeAutospacing="1" w:after="100" w:afterAutospacing="1" w:line="240" w:lineRule="auto"/>
         <w:rPr>
@@ -399,29 +354,20 @@
       <w:r>
         <w:rPr>
           <w:rFonts w:ascii="PMingLiU" w:eastAsia="PMingLiU" w:hAnsi="PMingLiU" w:cs="PMingLiU"/>
-          <w:b/>
-          <w:bCs/>
-          <w:sz w:val="24"/>
-          <w:szCs w:val="24"/>
-          <w:lang w:eastAsia="zh-TW"/>
-        </w:rPr>
-        <w:t>BR6</w:t>
-      </w:r>
-      <w:r>
-        <w:rPr>
-          <w:rFonts w:ascii="PMingLiU" w:eastAsia="PMingLiU" w:hAnsi="PMingLiU" w:cs="PMingLiU"/>
-          <w:sz w:val="24"/>
-          <w:szCs w:val="24"/>
-          <w:lang w:eastAsia="zh-TW"/>
-        </w:rPr>
-        <w:t>: Support dataset sizes from small (hundreds) to demo scale (thousands), with stress test up to 100k rows.</w:t>
-      </w:r>
+          <w:sz w:val="24"/>
+          <w:szCs w:val="24"/>
+          <w:lang w:eastAsia="zh-TW"/>
+        </w:rPr>
+        <w:t>BR6: Support dataset sizes from small (hundreds) to demo scale (thousands), with stress test up to 100k rows.</w:t>
+      </w:r>
+      <w:bookmarkStart w:id="0" w:name="_GoBack"/>
+      <w:bookmarkEnd w:id="0"/>
     </w:p>
     <w:p>
       <w:pPr>
         <w:numPr>
           <w:ilvl w:val="0"/>
-          <w:numId w:val="3"/>
+          <w:numId w:val="9"/>
         </w:numPr>
         <w:spacing w:before="100" w:beforeAutospacing="1" w:after="100" w:afterAutospacing="1" w:line="240" w:lineRule="auto"/>
         <w:rPr>
@@ -434,22 +380,11 @@
       <w:r>
         <w:rPr>
           <w:rFonts w:ascii="PMingLiU" w:eastAsia="PMingLiU" w:hAnsi="PMingLiU" w:cs="PMingLiU"/>
-          <w:b/>
-          <w:bCs/>
-          <w:sz w:val="24"/>
-          <w:szCs w:val="24"/>
-          <w:lang w:eastAsia="zh-TW"/>
-        </w:rPr>
-        <w:t>BR7</w:t>
-      </w:r>
-      <w:r>
-        <w:rPr>
-          <w:rFonts w:ascii="PMingLiU" w:eastAsia="PMingLiU" w:hAnsi="PMingLiU" w:cs="PMingLiU"/>
-          <w:sz w:val="24"/>
-          <w:szCs w:val="24"/>
-          <w:lang w:eastAsia="zh-TW"/>
-        </w:rPr>
-        <w:t xml:space="preserve">: Ensure pipeline performance: </w:t>
+          <w:sz w:val="24"/>
+          <w:szCs w:val="24"/>
+          <w:lang w:eastAsia="zh-TW"/>
+        </w:rPr>
+        <w:t xml:space="preserve">BR7: Ensure pipeline performance: </w:t>
       </w:r>
       <w:r>
         <w:rPr>
@@ -474,7 +409,7 @@
       <w:pPr>
         <w:numPr>
           <w:ilvl w:val="0"/>
-          <w:numId w:val="3"/>
+          <w:numId w:val="9"/>
         </w:numPr>
         <w:spacing w:before="100" w:beforeAutospacing="1" w:after="100" w:afterAutospacing="1" w:line="240" w:lineRule="auto"/>
         <w:rPr>
@@ -487,29 +422,18 @@
       <w:r>
         <w:rPr>
           <w:rFonts w:ascii="PMingLiU" w:eastAsia="PMingLiU" w:hAnsi="PMingLiU" w:cs="PMingLiU"/>
-          <w:b/>
-          <w:bCs/>
-          <w:sz w:val="24"/>
-          <w:szCs w:val="24"/>
-          <w:lang w:eastAsia="zh-TW"/>
-        </w:rPr>
-        <w:t>BR8</w:t>
-      </w:r>
-      <w:r>
-        <w:rPr>
-          <w:rFonts w:ascii="PMingLiU" w:eastAsia="PMingLiU" w:hAnsi="PMingLiU" w:cs="PMingLiU"/>
-          <w:sz w:val="24"/>
-          <w:szCs w:val="24"/>
-          <w:lang w:eastAsia="zh-TW"/>
-        </w:rPr>
-        <w:t>: Provide clear documentation (Guideline docs + README) for quick setup and demo.</w:t>
+          <w:sz w:val="24"/>
+          <w:szCs w:val="24"/>
+          <w:lang w:eastAsia="zh-TW"/>
+        </w:rPr>
+        <w:t>BR8: Provide clear documentation (Guideline docs + README) for quick setup and demo.</w:t>
       </w:r>
     </w:p>
     <w:p>
       <w:pPr>
         <w:numPr>
           <w:ilvl w:val="0"/>
-          <w:numId w:val="3"/>
+          <w:numId w:val="9"/>
         </w:numPr>
         <w:spacing w:before="100" w:beforeAutospacing="1" w:after="100" w:afterAutospacing="1" w:line="240" w:lineRule="auto"/>
         <w:rPr>
@@ -522,22 +446,11 @@
       <w:r>
         <w:rPr>
           <w:rFonts w:ascii="PMingLiU" w:eastAsia="PMingLiU" w:hAnsi="PMingLiU" w:cs="PMingLiU"/>
-          <w:b/>
-          <w:bCs/>
-          <w:sz w:val="24"/>
-          <w:szCs w:val="24"/>
-          <w:lang w:eastAsia="zh-TW"/>
-        </w:rPr>
-        <w:t>BR9</w:t>
-      </w:r>
-      <w:r>
-        <w:rPr>
-          <w:rFonts w:ascii="PMingLiU" w:eastAsia="PMingLiU" w:hAnsi="PMingLiU" w:cs="PMingLiU"/>
-          <w:sz w:val="24"/>
-          <w:szCs w:val="24"/>
-          <w:lang w:eastAsia="zh-TW"/>
-        </w:rPr>
-        <w:t>: Deliver a GitHub repo containing ETL scripts, SQL schema + sample data, dashboard code, and documentation.</w:t>
+          <w:sz w:val="24"/>
+          <w:szCs w:val="24"/>
+          <w:lang w:eastAsia="zh-TW"/>
+        </w:rPr>
+        <w:t>BR9: Deliver a GitHub repo containing ETL scripts, SQL schema + sample data, dashboard code, and documentation.</w:t>
       </w:r>
     </w:p>
     <w:p>
@@ -563,9 +476,254 @@
       </w:r>
     </w:p>
     <w:p>
-      <w:bookmarkStart w:id="0" w:name="_GoBack"/>
-      <w:bookmarkEnd w:id="0"/>
+      <w:pPr>
+        <w:spacing w:before="100" w:beforeAutospacing="1" w:after="100" w:afterAutospacing="1" w:line="240" w:lineRule="auto"/>
+        <w:outlineLvl w:val="2"/>
+        <w:rPr>
+          <w:rFonts w:ascii="PMingLiU" w:eastAsia="PMingLiU" w:hAnsi="PMingLiU" w:cs="PMingLiU"/>
+          <w:b/>
+          <w:bCs/>
+          <w:sz w:val="27"/>
+          <w:szCs w:val="27"/>
+          <w:lang w:eastAsia="zh-TW"/>
+        </w:rPr>
+      </w:pPr>
+      <w:r>
+        <w:rPr>
+          <w:rFonts w:ascii="PMingLiU" w:eastAsia="PMingLiU" w:hAnsi="PMingLiU" w:cs="PMingLiU"/>
+          <w:b/>
+          <w:bCs/>
+          <w:sz w:val="27"/>
+          <w:szCs w:val="27"/>
+          <w:lang w:eastAsia="zh-TW"/>
+        </w:rPr>
+        <w:t>2. Methodology</w:t>
+      </w:r>
     </w:p>
+    <w:p>
+      <w:pPr>
+        <w:spacing w:before="100" w:beforeAutospacing="1" w:after="100" w:afterAutospacing="1" w:line="240" w:lineRule="auto"/>
+        <w:rPr>
+          <w:rFonts w:ascii="PMingLiU" w:eastAsia="PMingLiU" w:hAnsi="PMingLiU" w:cs="PMingLiU"/>
+          <w:sz w:val="24"/>
+          <w:szCs w:val="24"/>
+          <w:lang w:eastAsia="zh-TW"/>
+        </w:rPr>
+      </w:pPr>
+      <w:r>
+        <w:rPr>
+          <w:rFonts w:ascii="PMingLiU" w:eastAsia="PMingLiU" w:hAnsi="PMingLiU" w:cs="PMingLiU"/>
+          <w:sz w:val="24"/>
+          <w:szCs w:val="24"/>
+          <w:lang w:eastAsia="zh-TW"/>
+        </w:rPr>
+        <w:t>This ETL mini</w:t>
+      </w:r>
+      <w:r>
+        <w:rPr>
+          <w:rFonts w:ascii="PMingLiU" w:eastAsia="PMingLiU" w:hAnsi="PMingLiU" w:cs="PMingLiU"/>
+          <w:sz w:val="24"/>
+          <w:szCs w:val="24"/>
+          <w:lang w:eastAsia="zh-TW"/>
+        </w:rPr>
+        <w:noBreakHyphen/>
+        <w:t>project was completed with the assistance of AI Copilot, which generated much of the coding and draft documentation. The AI provided:</w:t>
+      </w:r>
+    </w:p>
+    <w:p>
+      <w:pPr>
+        <w:numPr>
+          <w:ilvl w:val="0"/>
+          <w:numId w:val="10"/>
+        </w:numPr>
+        <w:spacing w:before="100" w:beforeAutospacing="1" w:after="100" w:afterAutospacing="1" w:line="240" w:lineRule="auto"/>
+        <w:rPr>
+          <w:rFonts w:ascii="PMingLiU" w:eastAsia="PMingLiU" w:hAnsi="PMingLiU" w:cs="PMingLiU"/>
+          <w:sz w:val="24"/>
+          <w:szCs w:val="24"/>
+          <w:lang w:eastAsia="zh-TW"/>
+        </w:rPr>
+      </w:pPr>
+      <w:r>
+        <w:rPr>
+          <w:rFonts w:ascii="PMingLiU" w:eastAsia="PMingLiU" w:hAnsi="PMingLiU" w:cs="PMingLiU"/>
+          <w:b/>
+          <w:bCs/>
+          <w:sz w:val="24"/>
+          <w:szCs w:val="24"/>
+          <w:lang w:eastAsia="zh-TW"/>
+        </w:rPr>
+        <w:t>Code modules</w:t>
+      </w:r>
+      <w:r>
+        <w:rPr>
+          <w:rFonts w:ascii="PMingLiU" w:eastAsia="PMingLiU" w:hAnsi="PMingLiU" w:cs="PMingLiU"/>
+          <w:sz w:val="24"/>
+          <w:szCs w:val="24"/>
+          <w:lang w:eastAsia="zh-TW"/>
+        </w:rPr>
+        <w:t xml:space="preserve"> for extraction, transformation, loading, and Basel III ratio automation.</w:t>
+      </w:r>
+    </w:p>
+    <w:p>
+      <w:pPr>
+        <w:numPr>
+          <w:ilvl w:val="0"/>
+          <w:numId w:val="10"/>
+        </w:numPr>
+        <w:spacing w:before="100" w:beforeAutospacing="1" w:after="100" w:afterAutospacing="1" w:line="240" w:lineRule="auto"/>
+        <w:rPr>
+          <w:rFonts w:ascii="PMingLiU" w:eastAsia="PMingLiU" w:hAnsi="PMingLiU" w:cs="PMingLiU"/>
+          <w:sz w:val="24"/>
+          <w:szCs w:val="24"/>
+          <w:lang w:eastAsia="zh-TW"/>
+        </w:rPr>
+      </w:pPr>
+      <w:r>
+        <w:rPr>
+          <w:rFonts w:ascii="PMingLiU" w:eastAsia="PMingLiU" w:hAnsi="PMingLiU" w:cs="PMingLiU"/>
+          <w:b/>
+          <w:bCs/>
+          <w:sz w:val="24"/>
+          <w:szCs w:val="24"/>
+          <w:lang w:eastAsia="zh-TW"/>
+        </w:rPr>
+        <w:t>Draft documentation</w:t>
+      </w:r>
+      <w:r>
+        <w:rPr>
+          <w:rFonts w:ascii="PMingLiU" w:eastAsia="PMingLiU" w:hAnsi="PMingLiU" w:cs="PMingLiU"/>
+          <w:sz w:val="24"/>
+          <w:szCs w:val="24"/>
+          <w:lang w:eastAsia="zh-TW"/>
+        </w:rPr>
+        <w:t xml:space="preserve"> across installation guidelines, schema setup, automation, and dashboard phases.</w:t>
+      </w:r>
+    </w:p>
+    <w:p>
+      <w:pPr>
+        <w:spacing w:before="100" w:beforeAutospacing="1" w:after="100" w:afterAutospacing="1" w:line="240" w:lineRule="auto"/>
+        <w:rPr>
+          <w:rFonts w:ascii="PMingLiU" w:eastAsia="PMingLiU" w:hAnsi="PMingLiU" w:cs="PMingLiU"/>
+          <w:sz w:val="24"/>
+          <w:szCs w:val="24"/>
+          <w:lang w:eastAsia="zh-TW"/>
+        </w:rPr>
+      </w:pPr>
+      <w:r>
+        <w:rPr>
+          <w:rFonts w:ascii="PMingLiU" w:eastAsia="PMingLiU" w:hAnsi="PMingLiU" w:cs="PMingLiU"/>
+          <w:sz w:val="24"/>
+          <w:szCs w:val="24"/>
+          <w:lang w:eastAsia="zh-TW"/>
+        </w:rPr>
+        <w:t>My contribution focused on:</w:t>
+      </w:r>
+    </w:p>
+    <w:p>
+      <w:pPr>
+        <w:numPr>
+          <w:ilvl w:val="0"/>
+          <w:numId w:val="11"/>
+        </w:numPr>
+        <w:spacing w:before="100" w:beforeAutospacing="1" w:after="100" w:afterAutospacing="1" w:line="240" w:lineRule="auto"/>
+        <w:rPr>
+          <w:rFonts w:ascii="PMingLiU" w:eastAsia="PMingLiU" w:hAnsi="PMingLiU" w:cs="PMingLiU"/>
+          <w:sz w:val="24"/>
+          <w:szCs w:val="24"/>
+          <w:lang w:eastAsia="zh-TW"/>
+        </w:rPr>
+      </w:pPr>
+      <w:r>
+        <w:rPr>
+          <w:rFonts w:ascii="PMingLiU" w:eastAsia="PMingLiU" w:hAnsi="PMingLiU" w:cs="PMingLiU"/>
+          <w:b/>
+          <w:bCs/>
+          <w:sz w:val="24"/>
+          <w:szCs w:val="24"/>
+          <w:lang w:eastAsia="zh-TW"/>
+        </w:rPr>
+        <w:t>Integration of components</w:t>
+      </w:r>
+      <w:r>
+        <w:rPr>
+          <w:rFonts w:ascii="PMingLiU" w:eastAsia="PMingLiU" w:hAnsi="PMingLiU" w:cs="PMingLiU"/>
+          <w:sz w:val="24"/>
+          <w:szCs w:val="24"/>
+          <w:lang w:eastAsia="zh-TW"/>
+        </w:rPr>
+        <w:t xml:space="preserve"> — ETL scripts, SQL schema, data quality checks, and visualization — into a cohesive mini</w:t>
+      </w:r>
+      <w:r>
+        <w:rPr>
+          <w:rFonts w:ascii="PMingLiU" w:eastAsia="PMingLiU" w:hAnsi="PMingLiU" w:cs="PMingLiU"/>
+          <w:sz w:val="24"/>
+          <w:szCs w:val="24"/>
+          <w:lang w:eastAsia="zh-TW"/>
+        </w:rPr>
+        <w:noBreakHyphen/>
+        <w:t>project that demonstrates both technical reproducibility and business clarity.</w:t>
+      </w:r>
+    </w:p>
+    <w:p>
+      <w:pPr>
+        <w:numPr>
+          <w:ilvl w:val="0"/>
+          <w:numId w:val="11"/>
+        </w:numPr>
+        <w:spacing w:before="100" w:beforeAutospacing="1" w:after="100" w:afterAutospacing="1" w:line="240" w:lineRule="auto"/>
+        <w:rPr>
+          <w:rFonts w:ascii="PMingLiU" w:eastAsia="PMingLiU" w:hAnsi="PMingLiU" w:cs="PMingLiU"/>
+          <w:sz w:val="24"/>
+          <w:szCs w:val="24"/>
+          <w:lang w:eastAsia="zh-TW"/>
+        </w:rPr>
+      </w:pPr>
+      <w:r>
+        <w:rPr>
+          <w:rFonts w:ascii="PMingLiU" w:eastAsia="PMingLiU" w:hAnsi="PMingLiU" w:cs="PMingLiU"/>
+          <w:b/>
+          <w:bCs/>
+          <w:sz w:val="24"/>
+          <w:szCs w:val="24"/>
+          <w:lang w:eastAsia="zh-TW"/>
+        </w:rPr>
+        <w:lastRenderedPageBreak/>
+        <w:t>Final structuring</w:t>
+      </w:r>
+      <w:r>
+        <w:rPr>
+          <w:rFonts w:ascii="PMingLiU" w:eastAsia="PMingLiU" w:hAnsi="PMingLiU" w:cs="PMingLiU"/>
+          <w:sz w:val="24"/>
+          <w:szCs w:val="24"/>
+          <w:lang w:eastAsia="zh-TW"/>
+        </w:rPr>
+        <w:t xml:space="preserve"> and quality checks to ensure the project is presented in a professional and reliable manner.</w:t>
+      </w:r>
+    </w:p>
+    <w:p>
+      <w:pPr>
+        <w:spacing w:after="0" w:line="240" w:lineRule="auto"/>
+        <w:rPr>
+          <w:rFonts w:ascii="PMingLiU" w:eastAsia="PMingLiU" w:hAnsi="PMingLiU" w:cs="PMingLiU"/>
+          <w:sz w:val="24"/>
+          <w:szCs w:val="24"/>
+          <w:lang w:eastAsia="zh-TW"/>
+        </w:rPr>
+      </w:pPr>
+      <w:r>
+        <w:rPr>
+          <w:rFonts w:ascii="PMingLiU" w:eastAsia="PMingLiU" w:hAnsi="PMingLiU" w:cs="PMingLiU"/>
+          <w:sz w:val="24"/>
+          <w:szCs w:val="24"/>
+          <w:lang w:eastAsia="zh-TW"/>
+        </w:rPr>
+        <w:pict>
+          <v:rect id="_x0000_i1028" style="width:0;height:1.5pt" o:hralign="center" o:hrstd="t" o:hr="t" fillcolor="#a0a0a0" stroked="f"/>
+        </w:pict>
+      </w:r>
+    </w:p>
+    <w:p/>
     <w:sectPr>
       <w:pgSz w:w="12240" w:h="15840"/>
       <w:pgMar w:top="1440" w:right="1800" w:bottom="1440" w:left="1800" w:header="708" w:footer="708" w:gutter="0"/>
@@ -579,6 +737,542 @@
 <file path=word/numbering.xml><?xml version="1.0" encoding="utf-8"?>
 <w:numbering xmlns:wpc="http://schemas.microsoft.com/office/word/2010/wordprocessingCanvas" xmlns:cx="http://schemas.microsoft.com/office/drawing/2014/chartex" xmlns:cx1="http://schemas.microsoft.com/office/drawing/2015/9/8/chartex" xmlns:mc="http://schemas.openxmlformats.org/markup-compatibility/2006" xmlns:o="urn:schemas-microsoft-com:office:office" xmlns:r="http://schemas.openxmlformats.org/officeDocument/2006/relationships" xmlns:m="http://schemas.openxmlformats.org/officeDocument/2006/math" xmlns:v="urn:schemas-microsoft-com:vml" xmlns:wp14="http://schemas.microsoft.com/office/word/2010/wordprocessingDrawing" xmlns:wp="http://schemas.openxmlformats.org/drawingml/2006/wordprocessingDrawing" xmlns:w10="urn:schemas-microsoft-com:office:word" xmlns:w="http://schemas.openxmlformats.org/wordprocessingml/2006/main" xmlns:w14="http://schemas.microsoft.com/office/word/2010/wordml" xmlns:w15="http://schemas.microsoft.com/office/word/2012/wordml" xmlns:w16se="http://schemas.microsoft.com/office/word/2015/wordml/symex" xmlns:wpg="http://schemas.microsoft.com/office/word/2010/wordprocessingGroup" xmlns:wpi="http://schemas.microsoft.com/office/word/2010/wordprocessingInk" xmlns:wne="http://schemas.microsoft.com/office/word/2006/wordml" xmlns:wps="http://schemas.microsoft.com/office/word/2010/wordprocessingShape" mc:Ignorable="w14 w15 w16se wp14">
   <w:abstractNum w:abstractNumId="0" w15:restartNumberingAfterBreak="0">
+    <w:nsid w:val="0C461C38"/>
+    <w:multiLevelType w:val="multilevel"/>
+    <w:tmpl w:val="92AEB088"/>
+    <w:lvl w:ilvl="0">
+      <w:start w:val="1"/>
+      <w:numFmt w:val="bullet"/>
+      <w:lvlText w:val=""/>
+      <w:lvlJc w:val="left"/>
+      <w:pPr>
+        <w:tabs>
+          <w:tab w:val="num" w:pos="720"/>
+        </w:tabs>
+        <w:ind w:left="720" w:hanging="360"/>
+      </w:pPr>
+      <w:rPr>
+        <w:rFonts w:ascii="Symbol" w:hAnsi="Symbol" w:hint="default"/>
+        <w:sz w:val="20"/>
+      </w:rPr>
+    </w:lvl>
+    <w:lvl w:ilvl="1" w:tentative="1">
+      <w:start w:val="1"/>
+      <w:numFmt w:val="bullet"/>
+      <w:lvlText w:val="o"/>
+      <w:lvlJc w:val="left"/>
+      <w:pPr>
+        <w:tabs>
+          <w:tab w:val="num" w:pos="1440"/>
+        </w:tabs>
+        <w:ind w:left="1440" w:hanging="360"/>
+      </w:pPr>
+      <w:rPr>
+        <w:rFonts w:ascii="Courier New" w:hAnsi="Courier New" w:hint="default"/>
+        <w:sz w:val="20"/>
+      </w:rPr>
+    </w:lvl>
+    <w:lvl w:ilvl="2" w:tentative="1">
+      <w:start w:val="1"/>
+      <w:numFmt w:val="bullet"/>
+      <w:lvlText w:val=""/>
+      <w:lvlJc w:val="left"/>
+      <w:pPr>
+        <w:tabs>
+          <w:tab w:val="num" w:pos="2160"/>
+        </w:tabs>
+        <w:ind w:left="2160" w:hanging="360"/>
+      </w:pPr>
+      <w:rPr>
+        <w:rFonts w:ascii="Wingdings" w:hAnsi="Wingdings" w:hint="default"/>
+        <w:sz w:val="20"/>
+      </w:rPr>
+    </w:lvl>
+    <w:lvl w:ilvl="3" w:tentative="1">
+      <w:start w:val="1"/>
+      <w:numFmt w:val="bullet"/>
+      <w:lvlText w:val=""/>
+      <w:lvlJc w:val="left"/>
+      <w:pPr>
+        <w:tabs>
+          <w:tab w:val="num" w:pos="2880"/>
+        </w:tabs>
+        <w:ind w:left="2880" w:hanging="360"/>
+      </w:pPr>
+      <w:rPr>
+        <w:rFonts w:ascii="Wingdings" w:hAnsi="Wingdings" w:hint="default"/>
+        <w:sz w:val="20"/>
+      </w:rPr>
+    </w:lvl>
+    <w:lvl w:ilvl="4" w:tentative="1">
+      <w:start w:val="1"/>
+      <w:numFmt w:val="bullet"/>
+      <w:lvlText w:val=""/>
+      <w:lvlJc w:val="left"/>
+      <w:pPr>
+        <w:tabs>
+          <w:tab w:val="num" w:pos="3600"/>
+        </w:tabs>
+        <w:ind w:left="3600" w:hanging="360"/>
+      </w:pPr>
+      <w:rPr>
+        <w:rFonts w:ascii="Wingdings" w:hAnsi="Wingdings" w:hint="default"/>
+        <w:sz w:val="20"/>
+      </w:rPr>
+    </w:lvl>
+    <w:lvl w:ilvl="5" w:tentative="1">
+      <w:start w:val="1"/>
+      <w:numFmt w:val="bullet"/>
+      <w:lvlText w:val=""/>
+      <w:lvlJc w:val="left"/>
+      <w:pPr>
+        <w:tabs>
+          <w:tab w:val="num" w:pos="4320"/>
+        </w:tabs>
+        <w:ind w:left="4320" w:hanging="360"/>
+      </w:pPr>
+      <w:rPr>
+        <w:rFonts w:ascii="Wingdings" w:hAnsi="Wingdings" w:hint="default"/>
+        <w:sz w:val="20"/>
+      </w:rPr>
+    </w:lvl>
+    <w:lvl w:ilvl="6" w:tentative="1">
+      <w:start w:val="1"/>
+      <w:numFmt w:val="bullet"/>
+      <w:lvlText w:val=""/>
+      <w:lvlJc w:val="left"/>
+      <w:pPr>
+        <w:tabs>
+          <w:tab w:val="num" w:pos="5040"/>
+        </w:tabs>
+        <w:ind w:left="5040" w:hanging="360"/>
+      </w:pPr>
+      <w:rPr>
+        <w:rFonts w:ascii="Wingdings" w:hAnsi="Wingdings" w:hint="default"/>
+        <w:sz w:val="20"/>
+      </w:rPr>
+    </w:lvl>
+    <w:lvl w:ilvl="7" w:tentative="1">
+      <w:start w:val="1"/>
+      <w:numFmt w:val="bullet"/>
+      <w:lvlText w:val=""/>
+      <w:lvlJc w:val="left"/>
+      <w:pPr>
+        <w:tabs>
+          <w:tab w:val="num" w:pos="5760"/>
+        </w:tabs>
+        <w:ind w:left="5760" w:hanging="360"/>
+      </w:pPr>
+      <w:rPr>
+        <w:rFonts w:ascii="Wingdings" w:hAnsi="Wingdings" w:hint="default"/>
+        <w:sz w:val="20"/>
+      </w:rPr>
+    </w:lvl>
+    <w:lvl w:ilvl="8" w:tentative="1">
+      <w:start w:val="1"/>
+      <w:numFmt w:val="bullet"/>
+      <w:lvlText w:val=""/>
+      <w:lvlJc w:val="left"/>
+      <w:pPr>
+        <w:tabs>
+          <w:tab w:val="num" w:pos="6480"/>
+        </w:tabs>
+        <w:ind w:left="6480" w:hanging="360"/>
+      </w:pPr>
+      <w:rPr>
+        <w:rFonts w:ascii="Wingdings" w:hAnsi="Wingdings" w:hint="default"/>
+        <w:sz w:val="20"/>
+      </w:rPr>
+    </w:lvl>
+  </w:abstractNum>
+  <w:abstractNum w:abstractNumId="1" w15:restartNumberingAfterBreak="0">
+    <w:nsid w:val="1A027239"/>
+    <w:multiLevelType w:val="multilevel"/>
+    <w:tmpl w:val="A13C00C4"/>
+    <w:lvl w:ilvl="0">
+      <w:start w:val="1"/>
+      <w:numFmt w:val="bullet"/>
+      <w:lvlText w:val=""/>
+      <w:lvlJc w:val="left"/>
+      <w:pPr>
+        <w:tabs>
+          <w:tab w:val="num" w:pos="720"/>
+        </w:tabs>
+        <w:ind w:left="720" w:hanging="360"/>
+      </w:pPr>
+      <w:rPr>
+        <w:rFonts w:ascii="Symbol" w:hAnsi="Symbol" w:hint="default"/>
+        <w:sz w:val="20"/>
+      </w:rPr>
+    </w:lvl>
+    <w:lvl w:ilvl="1" w:tentative="1">
+      <w:start w:val="1"/>
+      <w:numFmt w:val="bullet"/>
+      <w:lvlText w:val="o"/>
+      <w:lvlJc w:val="left"/>
+      <w:pPr>
+        <w:tabs>
+          <w:tab w:val="num" w:pos="1440"/>
+        </w:tabs>
+        <w:ind w:left="1440" w:hanging="360"/>
+      </w:pPr>
+      <w:rPr>
+        <w:rFonts w:ascii="Courier New" w:hAnsi="Courier New" w:hint="default"/>
+        <w:sz w:val="20"/>
+      </w:rPr>
+    </w:lvl>
+    <w:lvl w:ilvl="2" w:tentative="1">
+      <w:start w:val="1"/>
+      <w:numFmt w:val="bullet"/>
+      <w:lvlText w:val=""/>
+      <w:lvlJc w:val="left"/>
+      <w:pPr>
+        <w:tabs>
+          <w:tab w:val="num" w:pos="2160"/>
+        </w:tabs>
+        <w:ind w:left="2160" w:hanging="360"/>
+      </w:pPr>
+      <w:rPr>
+        <w:rFonts w:ascii="Wingdings" w:hAnsi="Wingdings" w:hint="default"/>
+        <w:sz w:val="20"/>
+      </w:rPr>
+    </w:lvl>
+    <w:lvl w:ilvl="3" w:tentative="1">
+      <w:start w:val="1"/>
+      <w:numFmt w:val="bullet"/>
+      <w:lvlText w:val=""/>
+      <w:lvlJc w:val="left"/>
+      <w:pPr>
+        <w:tabs>
+          <w:tab w:val="num" w:pos="2880"/>
+        </w:tabs>
+        <w:ind w:left="2880" w:hanging="360"/>
+      </w:pPr>
+      <w:rPr>
+        <w:rFonts w:ascii="Wingdings" w:hAnsi="Wingdings" w:hint="default"/>
+        <w:sz w:val="20"/>
+      </w:rPr>
+    </w:lvl>
+    <w:lvl w:ilvl="4" w:tentative="1">
+      <w:start w:val="1"/>
+      <w:numFmt w:val="bullet"/>
+      <w:lvlText w:val=""/>
+      <w:lvlJc w:val="left"/>
+      <w:pPr>
+        <w:tabs>
+          <w:tab w:val="num" w:pos="3600"/>
+        </w:tabs>
+        <w:ind w:left="3600" w:hanging="360"/>
+      </w:pPr>
+      <w:rPr>
+        <w:rFonts w:ascii="Wingdings" w:hAnsi="Wingdings" w:hint="default"/>
+        <w:sz w:val="20"/>
+      </w:rPr>
+    </w:lvl>
+    <w:lvl w:ilvl="5" w:tentative="1">
+      <w:start w:val="1"/>
+      <w:numFmt w:val="bullet"/>
+      <w:lvlText w:val=""/>
+      <w:lvlJc w:val="left"/>
+      <w:pPr>
+        <w:tabs>
+          <w:tab w:val="num" w:pos="4320"/>
+        </w:tabs>
+        <w:ind w:left="4320" w:hanging="360"/>
+      </w:pPr>
+      <w:rPr>
+        <w:rFonts w:ascii="Wingdings" w:hAnsi="Wingdings" w:hint="default"/>
+        <w:sz w:val="20"/>
+      </w:rPr>
+    </w:lvl>
+    <w:lvl w:ilvl="6" w:tentative="1">
+      <w:start w:val="1"/>
+      <w:numFmt w:val="bullet"/>
+      <w:lvlText w:val=""/>
+      <w:lvlJc w:val="left"/>
+      <w:pPr>
+        <w:tabs>
+          <w:tab w:val="num" w:pos="5040"/>
+        </w:tabs>
+        <w:ind w:left="5040" w:hanging="360"/>
+      </w:pPr>
+      <w:rPr>
+        <w:rFonts w:ascii="Wingdings" w:hAnsi="Wingdings" w:hint="default"/>
+        <w:sz w:val="20"/>
+      </w:rPr>
+    </w:lvl>
+    <w:lvl w:ilvl="7" w:tentative="1">
+      <w:start w:val="1"/>
+      <w:numFmt w:val="bullet"/>
+      <w:lvlText w:val=""/>
+      <w:lvlJc w:val="left"/>
+      <w:pPr>
+        <w:tabs>
+          <w:tab w:val="num" w:pos="5760"/>
+        </w:tabs>
+        <w:ind w:left="5760" w:hanging="360"/>
+      </w:pPr>
+      <w:rPr>
+        <w:rFonts w:ascii="Wingdings" w:hAnsi="Wingdings" w:hint="default"/>
+        <w:sz w:val="20"/>
+      </w:rPr>
+    </w:lvl>
+    <w:lvl w:ilvl="8" w:tentative="1">
+      <w:start w:val="1"/>
+      <w:numFmt w:val="bullet"/>
+      <w:lvlText w:val=""/>
+      <w:lvlJc w:val="left"/>
+      <w:pPr>
+        <w:tabs>
+          <w:tab w:val="num" w:pos="6480"/>
+        </w:tabs>
+        <w:ind w:left="6480" w:hanging="360"/>
+      </w:pPr>
+      <w:rPr>
+        <w:rFonts w:ascii="Wingdings" w:hAnsi="Wingdings" w:hint="default"/>
+        <w:sz w:val="20"/>
+      </w:rPr>
+    </w:lvl>
+  </w:abstractNum>
+  <w:abstractNum w:abstractNumId="2" w15:restartNumberingAfterBreak="0">
+    <w:nsid w:val="1C1873B2"/>
+    <w:multiLevelType w:val="hybridMultilevel"/>
+    <w:tmpl w:val="B6240876"/>
+    <w:lvl w:ilvl="0" w:tplc="0409000F">
+      <w:start w:val="1"/>
+      <w:numFmt w:val="decimal"/>
+      <w:lvlText w:val="%1."/>
+      <w:lvlJc w:val="left"/>
+      <w:pPr>
+        <w:ind w:left="360" w:hanging="360"/>
+      </w:pPr>
+      <w:rPr>
+        <w:rFonts w:hint="default"/>
+      </w:rPr>
+    </w:lvl>
+    <w:lvl w:ilvl="1" w:tplc="04090019" w:tentative="1">
+      <w:start w:val="1"/>
+      <w:numFmt w:val="ideographTraditional"/>
+      <w:lvlText w:val="%2、"/>
+      <w:lvlJc w:val="left"/>
+      <w:pPr>
+        <w:ind w:left="960" w:hanging="480"/>
+      </w:pPr>
+    </w:lvl>
+    <w:lvl w:ilvl="2" w:tplc="0409001B" w:tentative="1">
+      <w:start w:val="1"/>
+      <w:numFmt w:val="lowerRoman"/>
+      <w:lvlText w:val="%3."/>
+      <w:lvlJc w:val="right"/>
+      <w:pPr>
+        <w:ind w:left="1440" w:hanging="480"/>
+      </w:pPr>
+    </w:lvl>
+    <w:lvl w:ilvl="3" w:tplc="0409000F" w:tentative="1">
+      <w:start w:val="1"/>
+      <w:numFmt w:val="decimal"/>
+      <w:lvlText w:val="%4."/>
+      <w:lvlJc w:val="left"/>
+      <w:pPr>
+        <w:ind w:left="1920" w:hanging="480"/>
+      </w:pPr>
+    </w:lvl>
+    <w:lvl w:ilvl="4" w:tplc="04090019" w:tentative="1">
+      <w:start w:val="1"/>
+      <w:numFmt w:val="ideographTraditional"/>
+      <w:lvlText w:val="%5、"/>
+      <w:lvlJc w:val="left"/>
+      <w:pPr>
+        <w:ind w:left="2400" w:hanging="480"/>
+      </w:pPr>
+    </w:lvl>
+    <w:lvl w:ilvl="5" w:tplc="0409001B" w:tentative="1">
+      <w:start w:val="1"/>
+      <w:numFmt w:val="lowerRoman"/>
+      <w:lvlText w:val="%6."/>
+      <w:lvlJc w:val="right"/>
+      <w:pPr>
+        <w:ind w:left="2880" w:hanging="480"/>
+      </w:pPr>
+    </w:lvl>
+    <w:lvl w:ilvl="6" w:tplc="0409000F" w:tentative="1">
+      <w:start w:val="1"/>
+      <w:numFmt w:val="decimal"/>
+      <w:lvlText w:val="%7."/>
+      <w:lvlJc w:val="left"/>
+      <w:pPr>
+        <w:ind w:left="3360" w:hanging="480"/>
+      </w:pPr>
+    </w:lvl>
+    <w:lvl w:ilvl="7" w:tplc="04090019" w:tentative="1">
+      <w:start w:val="1"/>
+      <w:numFmt w:val="ideographTraditional"/>
+      <w:lvlText w:val="%8、"/>
+      <w:lvlJc w:val="left"/>
+      <w:pPr>
+        <w:ind w:left="3840" w:hanging="480"/>
+      </w:pPr>
+    </w:lvl>
+    <w:lvl w:ilvl="8" w:tplc="0409001B" w:tentative="1">
+      <w:start w:val="1"/>
+      <w:numFmt w:val="lowerRoman"/>
+      <w:lvlText w:val="%9."/>
+      <w:lvlJc w:val="right"/>
+      <w:pPr>
+        <w:ind w:left="4320" w:hanging="480"/>
+      </w:pPr>
+    </w:lvl>
+  </w:abstractNum>
+  <w:abstractNum w:abstractNumId="3" w15:restartNumberingAfterBreak="0">
+    <w:nsid w:val="2C1716A9"/>
+    <w:multiLevelType w:val="multilevel"/>
+    <w:tmpl w:val="07E2BC3E"/>
+    <w:lvl w:ilvl="0">
+      <w:start w:val="1"/>
+      <w:numFmt w:val="bullet"/>
+      <w:lvlText w:val=""/>
+      <w:lvlJc w:val="left"/>
+      <w:pPr>
+        <w:tabs>
+          <w:tab w:val="num" w:pos="720"/>
+        </w:tabs>
+        <w:ind w:left="720" w:hanging="360"/>
+      </w:pPr>
+      <w:rPr>
+        <w:rFonts w:ascii="Symbol" w:hAnsi="Symbol" w:hint="default"/>
+        <w:sz w:val="20"/>
+      </w:rPr>
+    </w:lvl>
+    <w:lvl w:ilvl="1" w:tentative="1">
+      <w:start w:val="1"/>
+      <w:numFmt w:val="bullet"/>
+      <w:lvlText w:val="o"/>
+      <w:lvlJc w:val="left"/>
+      <w:pPr>
+        <w:tabs>
+          <w:tab w:val="num" w:pos="1440"/>
+        </w:tabs>
+        <w:ind w:left="1440" w:hanging="360"/>
+      </w:pPr>
+      <w:rPr>
+        <w:rFonts w:ascii="Courier New" w:hAnsi="Courier New" w:hint="default"/>
+        <w:sz w:val="20"/>
+      </w:rPr>
+    </w:lvl>
+    <w:lvl w:ilvl="2" w:tentative="1">
+      <w:start w:val="1"/>
+      <w:numFmt w:val="bullet"/>
+      <w:lvlText w:val=""/>
+      <w:lvlJc w:val="left"/>
+      <w:pPr>
+        <w:tabs>
+          <w:tab w:val="num" w:pos="2160"/>
+        </w:tabs>
+        <w:ind w:left="2160" w:hanging="360"/>
+      </w:pPr>
+      <w:rPr>
+        <w:rFonts w:ascii="Wingdings" w:hAnsi="Wingdings" w:hint="default"/>
+        <w:sz w:val="20"/>
+      </w:rPr>
+    </w:lvl>
+    <w:lvl w:ilvl="3" w:tentative="1">
+      <w:start w:val="1"/>
+      <w:numFmt w:val="bullet"/>
+      <w:lvlText w:val=""/>
+      <w:lvlJc w:val="left"/>
+      <w:pPr>
+        <w:tabs>
+          <w:tab w:val="num" w:pos="2880"/>
+        </w:tabs>
+        <w:ind w:left="2880" w:hanging="360"/>
+      </w:pPr>
+      <w:rPr>
+        <w:rFonts w:ascii="Wingdings" w:hAnsi="Wingdings" w:hint="default"/>
+        <w:sz w:val="20"/>
+      </w:rPr>
+    </w:lvl>
+    <w:lvl w:ilvl="4" w:tentative="1">
+      <w:start w:val="1"/>
+      <w:numFmt w:val="bullet"/>
+      <w:lvlText w:val=""/>
+      <w:lvlJc w:val="left"/>
+      <w:pPr>
+        <w:tabs>
+          <w:tab w:val="num" w:pos="3600"/>
+        </w:tabs>
+        <w:ind w:left="3600" w:hanging="360"/>
+      </w:pPr>
+      <w:rPr>
+        <w:rFonts w:ascii="Wingdings" w:hAnsi="Wingdings" w:hint="default"/>
+        <w:sz w:val="20"/>
+      </w:rPr>
+    </w:lvl>
+    <w:lvl w:ilvl="5" w:tentative="1">
+      <w:start w:val="1"/>
+      <w:numFmt w:val="bullet"/>
+      <w:lvlText w:val=""/>
+      <w:lvlJc w:val="left"/>
+      <w:pPr>
+        <w:tabs>
+          <w:tab w:val="num" w:pos="4320"/>
+        </w:tabs>
+        <w:ind w:left="4320" w:hanging="360"/>
+      </w:pPr>
+      <w:rPr>
+        <w:rFonts w:ascii="Wingdings" w:hAnsi="Wingdings" w:hint="default"/>
+        <w:sz w:val="20"/>
+      </w:rPr>
+    </w:lvl>
+    <w:lvl w:ilvl="6" w:tentative="1">
+      <w:start w:val="1"/>
+      <w:numFmt w:val="bullet"/>
+      <w:lvlText w:val=""/>
+      <w:lvlJc w:val="left"/>
+      <w:pPr>
+        <w:tabs>
+          <w:tab w:val="num" w:pos="5040"/>
+        </w:tabs>
+        <w:ind w:left="5040" w:hanging="360"/>
+      </w:pPr>
+      <w:rPr>
+        <w:rFonts w:ascii="Wingdings" w:hAnsi="Wingdings" w:hint="default"/>
+        <w:sz w:val="20"/>
+      </w:rPr>
+    </w:lvl>
+    <w:lvl w:ilvl="7" w:tentative="1">
+      <w:start w:val="1"/>
+      <w:numFmt w:val="bullet"/>
+      <w:lvlText w:val=""/>
+      <w:lvlJc w:val="left"/>
+      <w:pPr>
+        <w:tabs>
+          <w:tab w:val="num" w:pos="5760"/>
+        </w:tabs>
+        <w:ind w:left="5760" w:hanging="360"/>
+      </w:pPr>
+      <w:rPr>
+        <w:rFonts w:ascii="Wingdings" w:hAnsi="Wingdings" w:hint="default"/>
+        <w:sz w:val="20"/>
+      </w:rPr>
+    </w:lvl>
+    <w:lvl w:ilvl="8" w:tentative="1">
+      <w:start w:val="1"/>
+      <w:numFmt w:val="bullet"/>
+      <w:lvlText w:val=""/>
+      <w:lvlJc w:val="left"/>
+      <w:pPr>
+        <w:tabs>
+          <w:tab w:val="num" w:pos="6480"/>
+        </w:tabs>
+        <w:ind w:left="6480" w:hanging="360"/>
+      </w:pPr>
+      <w:rPr>
+        <w:rFonts w:ascii="Wingdings" w:hAnsi="Wingdings" w:hint="default"/>
+        <w:sz w:val="20"/>
+      </w:rPr>
+    </w:lvl>
+  </w:abstractNum>
+  <w:abstractNum w:abstractNumId="4" w15:restartNumberingAfterBreak="0">
     <w:nsid w:val="2FB85C3D"/>
     <w:multiLevelType w:val="multilevel"/>
     <w:tmpl w:val="D472B40E"/>
@@ -727,10 +1421,159 @@
       </w:rPr>
     </w:lvl>
   </w:abstractNum>
-  <w:abstractNum w:abstractNumId="1" w15:restartNumberingAfterBreak="0">
+  <w:abstractNum w:abstractNumId="5" w15:restartNumberingAfterBreak="0">
+    <w:nsid w:val="31E148BB"/>
+    <w:multiLevelType w:val="multilevel"/>
+    <w:tmpl w:val="F6D860C8"/>
+    <w:lvl w:ilvl="0">
+      <w:start w:val="1"/>
+      <w:numFmt w:val="bullet"/>
+      <w:lvlText w:val=""/>
+      <w:lvlJc w:val="left"/>
+      <w:pPr>
+        <w:tabs>
+          <w:tab w:val="num" w:pos="720"/>
+        </w:tabs>
+        <w:ind w:left="720" w:hanging="360"/>
+      </w:pPr>
+      <w:rPr>
+        <w:rFonts w:ascii="Symbol" w:hAnsi="Symbol" w:hint="default"/>
+        <w:sz w:val="20"/>
+      </w:rPr>
+    </w:lvl>
+    <w:lvl w:ilvl="1" w:tentative="1">
+      <w:start w:val="1"/>
+      <w:numFmt w:val="bullet"/>
+      <w:lvlText w:val="o"/>
+      <w:lvlJc w:val="left"/>
+      <w:pPr>
+        <w:tabs>
+          <w:tab w:val="num" w:pos="1440"/>
+        </w:tabs>
+        <w:ind w:left="1440" w:hanging="360"/>
+      </w:pPr>
+      <w:rPr>
+        <w:rFonts w:ascii="Courier New" w:hAnsi="Courier New" w:hint="default"/>
+        <w:sz w:val="20"/>
+      </w:rPr>
+    </w:lvl>
+    <w:lvl w:ilvl="2" w:tentative="1">
+      <w:start w:val="1"/>
+      <w:numFmt w:val="bullet"/>
+      <w:lvlText w:val=""/>
+      <w:lvlJc w:val="left"/>
+      <w:pPr>
+        <w:tabs>
+          <w:tab w:val="num" w:pos="2160"/>
+        </w:tabs>
+        <w:ind w:left="2160" w:hanging="360"/>
+      </w:pPr>
+      <w:rPr>
+        <w:rFonts w:ascii="Wingdings" w:hAnsi="Wingdings" w:hint="default"/>
+        <w:sz w:val="20"/>
+      </w:rPr>
+    </w:lvl>
+    <w:lvl w:ilvl="3" w:tentative="1">
+      <w:start w:val="1"/>
+      <w:numFmt w:val="bullet"/>
+      <w:lvlText w:val=""/>
+      <w:lvlJc w:val="left"/>
+      <w:pPr>
+        <w:tabs>
+          <w:tab w:val="num" w:pos="2880"/>
+        </w:tabs>
+        <w:ind w:left="2880" w:hanging="360"/>
+      </w:pPr>
+      <w:rPr>
+        <w:rFonts w:ascii="Wingdings" w:hAnsi="Wingdings" w:hint="default"/>
+        <w:sz w:val="20"/>
+      </w:rPr>
+    </w:lvl>
+    <w:lvl w:ilvl="4" w:tentative="1">
+      <w:start w:val="1"/>
+      <w:numFmt w:val="bullet"/>
+      <w:lvlText w:val=""/>
+      <w:lvlJc w:val="left"/>
+      <w:pPr>
+        <w:tabs>
+          <w:tab w:val="num" w:pos="3600"/>
+        </w:tabs>
+        <w:ind w:left="3600" w:hanging="360"/>
+      </w:pPr>
+      <w:rPr>
+        <w:rFonts w:ascii="Wingdings" w:hAnsi="Wingdings" w:hint="default"/>
+        <w:sz w:val="20"/>
+      </w:rPr>
+    </w:lvl>
+    <w:lvl w:ilvl="5" w:tentative="1">
+      <w:start w:val="1"/>
+      <w:numFmt w:val="bullet"/>
+      <w:lvlText w:val=""/>
+      <w:lvlJc w:val="left"/>
+      <w:pPr>
+        <w:tabs>
+          <w:tab w:val="num" w:pos="4320"/>
+        </w:tabs>
+        <w:ind w:left="4320" w:hanging="360"/>
+      </w:pPr>
+      <w:rPr>
+        <w:rFonts w:ascii="Wingdings" w:hAnsi="Wingdings" w:hint="default"/>
+        <w:sz w:val="20"/>
+      </w:rPr>
+    </w:lvl>
+    <w:lvl w:ilvl="6" w:tentative="1">
+      <w:start w:val="1"/>
+      <w:numFmt w:val="bullet"/>
+      <w:lvlText w:val=""/>
+      <w:lvlJc w:val="left"/>
+      <w:pPr>
+        <w:tabs>
+          <w:tab w:val="num" w:pos="5040"/>
+        </w:tabs>
+        <w:ind w:left="5040" w:hanging="360"/>
+      </w:pPr>
+      <w:rPr>
+        <w:rFonts w:ascii="Wingdings" w:hAnsi="Wingdings" w:hint="default"/>
+        <w:sz w:val="20"/>
+      </w:rPr>
+    </w:lvl>
+    <w:lvl w:ilvl="7" w:tentative="1">
+      <w:start w:val="1"/>
+      <w:numFmt w:val="bullet"/>
+      <w:lvlText w:val=""/>
+      <w:lvlJc w:val="left"/>
+      <w:pPr>
+        <w:tabs>
+          <w:tab w:val="num" w:pos="5760"/>
+        </w:tabs>
+        <w:ind w:left="5760" w:hanging="360"/>
+      </w:pPr>
+      <w:rPr>
+        <w:rFonts w:ascii="Wingdings" w:hAnsi="Wingdings" w:hint="default"/>
+        <w:sz w:val="20"/>
+      </w:rPr>
+    </w:lvl>
+    <w:lvl w:ilvl="8" w:tentative="1">
+      <w:start w:val="1"/>
+      <w:numFmt w:val="bullet"/>
+      <w:lvlText w:val=""/>
+      <w:lvlJc w:val="left"/>
+      <w:pPr>
+        <w:tabs>
+          <w:tab w:val="num" w:pos="6480"/>
+        </w:tabs>
+        <w:ind w:left="6480" w:hanging="360"/>
+      </w:pPr>
+      <w:rPr>
+        <w:rFonts w:ascii="Wingdings" w:hAnsi="Wingdings" w:hint="default"/>
+        <w:sz w:val="20"/>
+      </w:rPr>
+    </w:lvl>
+  </w:abstractNum>
+  <w:abstractNum w:abstractNumId="6" w15:restartNumberingAfterBreak="0">
     <w:nsid w:val="365C387F"/>
     <w:multiLevelType w:val="multilevel"/>
-    <w:tmpl w:val="41385482"/>
+    <w:tmpl w:val="4A8C67B4"/>
     <w:lvl w:ilvl="0">
       <w:start w:val="1"/>
       <w:numFmt w:val="bullet"/>
@@ -747,20 +1590,16 @@
         <w:sz w:val="20"/>
       </w:rPr>
     </w:lvl>
-    <w:lvl w:ilvl="1" w:tentative="1">
-      <w:start w:val="1"/>
-      <w:numFmt w:val="bullet"/>
-      <w:lvlText w:val="o"/>
-      <w:lvlJc w:val="left"/>
-      <w:pPr>
-        <w:tabs>
-          <w:tab w:val="num" w:pos="1440"/>
-        </w:tabs>
+    <w:lvl w:ilvl="1">
+      <w:start w:val="2"/>
+      <w:numFmt w:val="decimal"/>
+      <w:lvlText w:val="%2."/>
+      <w:lvlJc w:val="left"/>
+      <w:pPr>
         <w:ind w:left="1440" w:hanging="360"/>
       </w:pPr>
       <w:rPr>
-        <w:rFonts w:ascii="Courier New" w:hAnsi="Courier New" w:hint="default"/>
-        <w:sz w:val="20"/>
+        <w:rFonts w:hint="default"/>
       </w:rPr>
     </w:lvl>
     <w:lvl w:ilvl="2" w:tentative="1">
@@ -876,7 +1715,93 @@
       </w:rPr>
     </w:lvl>
   </w:abstractNum>
-  <w:abstractNum w:abstractNumId="2" w15:restartNumberingAfterBreak="0">
+  <w:abstractNum w:abstractNumId="7" w15:restartNumberingAfterBreak="0">
+    <w:nsid w:val="384206E2"/>
+    <w:multiLevelType w:val="hybridMultilevel"/>
+    <w:tmpl w:val="8F9484F6"/>
+    <w:lvl w:ilvl="0" w:tplc="0409000F">
+      <w:start w:val="1"/>
+      <w:numFmt w:val="decimal"/>
+      <w:lvlText w:val="%1."/>
+      <w:lvlJc w:val="left"/>
+      <w:pPr>
+        <w:ind w:left="480" w:hanging="480"/>
+      </w:pPr>
+    </w:lvl>
+    <w:lvl w:ilvl="1" w:tplc="04090019" w:tentative="1">
+      <w:start w:val="1"/>
+      <w:numFmt w:val="ideographTraditional"/>
+      <w:lvlText w:val="%2、"/>
+      <w:lvlJc w:val="left"/>
+      <w:pPr>
+        <w:ind w:left="960" w:hanging="480"/>
+      </w:pPr>
+    </w:lvl>
+    <w:lvl w:ilvl="2" w:tplc="0409001B" w:tentative="1">
+      <w:start w:val="1"/>
+      <w:numFmt w:val="lowerRoman"/>
+      <w:lvlText w:val="%3."/>
+      <w:lvlJc w:val="right"/>
+      <w:pPr>
+        <w:ind w:left="1440" w:hanging="480"/>
+      </w:pPr>
+    </w:lvl>
+    <w:lvl w:ilvl="3" w:tplc="0409000F" w:tentative="1">
+      <w:start w:val="1"/>
+      <w:numFmt w:val="decimal"/>
+      <w:lvlText w:val="%4."/>
+      <w:lvlJc w:val="left"/>
+      <w:pPr>
+        <w:ind w:left="1920" w:hanging="480"/>
+      </w:pPr>
+    </w:lvl>
+    <w:lvl w:ilvl="4" w:tplc="04090019" w:tentative="1">
+      <w:start w:val="1"/>
+      <w:numFmt w:val="ideographTraditional"/>
+      <w:lvlText w:val="%5、"/>
+      <w:lvlJc w:val="left"/>
+      <w:pPr>
+        <w:ind w:left="2400" w:hanging="480"/>
+      </w:pPr>
+    </w:lvl>
+    <w:lvl w:ilvl="5" w:tplc="0409001B" w:tentative="1">
+      <w:start w:val="1"/>
+      <w:numFmt w:val="lowerRoman"/>
+      <w:lvlText w:val="%6."/>
+      <w:lvlJc w:val="right"/>
+      <w:pPr>
+        <w:ind w:left="2880" w:hanging="480"/>
+      </w:pPr>
+    </w:lvl>
+    <w:lvl w:ilvl="6" w:tplc="0409000F" w:tentative="1">
+      <w:start w:val="1"/>
+      <w:numFmt w:val="decimal"/>
+      <w:lvlText w:val="%7."/>
+      <w:lvlJc w:val="left"/>
+      <w:pPr>
+        <w:ind w:left="3360" w:hanging="480"/>
+      </w:pPr>
+    </w:lvl>
+    <w:lvl w:ilvl="7" w:tplc="04090019" w:tentative="1">
+      <w:start w:val="1"/>
+      <w:numFmt w:val="ideographTraditional"/>
+      <w:lvlText w:val="%8、"/>
+      <w:lvlJc w:val="left"/>
+      <w:pPr>
+        <w:ind w:left="3840" w:hanging="480"/>
+      </w:pPr>
+    </w:lvl>
+    <w:lvl w:ilvl="8" w:tplc="0409001B" w:tentative="1">
+      <w:start w:val="1"/>
+      <w:numFmt w:val="lowerRoman"/>
+      <w:lvlText w:val="%9."/>
+      <w:lvlJc w:val="right"/>
+      <w:pPr>
+        <w:ind w:left="4320" w:hanging="480"/>
+      </w:pPr>
+    </w:lvl>
+  </w:abstractNum>
+  <w:abstractNum w:abstractNumId="8" w15:restartNumberingAfterBreak="0">
     <w:nsid w:val="560306AD"/>
     <w:multiLevelType w:val="multilevel"/>
     <w:tmpl w:val="A1222B34"/>
@@ -1025,7 +1950,156 @@
       </w:rPr>
     </w:lvl>
   </w:abstractNum>
-  <w:abstractNum w:abstractNumId="3" w15:restartNumberingAfterBreak="0">
+  <w:abstractNum w:abstractNumId="9" w15:restartNumberingAfterBreak="0">
+    <w:nsid w:val="704679B8"/>
+    <w:multiLevelType w:val="multilevel"/>
+    <w:tmpl w:val="9A78999E"/>
+    <w:lvl w:ilvl="0">
+      <w:start w:val="1"/>
+      <w:numFmt w:val="bullet"/>
+      <w:lvlText w:val=""/>
+      <w:lvlJc w:val="left"/>
+      <w:pPr>
+        <w:tabs>
+          <w:tab w:val="num" w:pos="720"/>
+        </w:tabs>
+        <w:ind w:left="720" w:hanging="360"/>
+      </w:pPr>
+      <w:rPr>
+        <w:rFonts w:ascii="Symbol" w:hAnsi="Symbol" w:hint="default"/>
+        <w:sz w:val="20"/>
+      </w:rPr>
+    </w:lvl>
+    <w:lvl w:ilvl="1" w:tentative="1">
+      <w:start w:val="1"/>
+      <w:numFmt w:val="bullet"/>
+      <w:lvlText w:val="o"/>
+      <w:lvlJc w:val="left"/>
+      <w:pPr>
+        <w:tabs>
+          <w:tab w:val="num" w:pos="1440"/>
+        </w:tabs>
+        <w:ind w:left="1440" w:hanging="360"/>
+      </w:pPr>
+      <w:rPr>
+        <w:rFonts w:ascii="Courier New" w:hAnsi="Courier New" w:hint="default"/>
+        <w:sz w:val="20"/>
+      </w:rPr>
+    </w:lvl>
+    <w:lvl w:ilvl="2" w:tentative="1">
+      <w:start w:val="1"/>
+      <w:numFmt w:val="bullet"/>
+      <w:lvlText w:val=""/>
+      <w:lvlJc w:val="left"/>
+      <w:pPr>
+        <w:tabs>
+          <w:tab w:val="num" w:pos="2160"/>
+        </w:tabs>
+        <w:ind w:left="2160" w:hanging="360"/>
+      </w:pPr>
+      <w:rPr>
+        <w:rFonts w:ascii="Wingdings" w:hAnsi="Wingdings" w:hint="default"/>
+        <w:sz w:val="20"/>
+      </w:rPr>
+    </w:lvl>
+    <w:lvl w:ilvl="3" w:tentative="1">
+      <w:start w:val="1"/>
+      <w:numFmt w:val="bullet"/>
+      <w:lvlText w:val=""/>
+      <w:lvlJc w:val="left"/>
+      <w:pPr>
+        <w:tabs>
+          <w:tab w:val="num" w:pos="2880"/>
+        </w:tabs>
+        <w:ind w:left="2880" w:hanging="360"/>
+      </w:pPr>
+      <w:rPr>
+        <w:rFonts w:ascii="Wingdings" w:hAnsi="Wingdings" w:hint="default"/>
+        <w:sz w:val="20"/>
+      </w:rPr>
+    </w:lvl>
+    <w:lvl w:ilvl="4" w:tentative="1">
+      <w:start w:val="1"/>
+      <w:numFmt w:val="bullet"/>
+      <w:lvlText w:val=""/>
+      <w:lvlJc w:val="left"/>
+      <w:pPr>
+        <w:tabs>
+          <w:tab w:val="num" w:pos="3600"/>
+        </w:tabs>
+        <w:ind w:left="3600" w:hanging="360"/>
+      </w:pPr>
+      <w:rPr>
+        <w:rFonts w:ascii="Wingdings" w:hAnsi="Wingdings" w:hint="default"/>
+        <w:sz w:val="20"/>
+      </w:rPr>
+    </w:lvl>
+    <w:lvl w:ilvl="5" w:tentative="1">
+      <w:start w:val="1"/>
+      <w:numFmt w:val="bullet"/>
+      <w:lvlText w:val=""/>
+      <w:lvlJc w:val="left"/>
+      <w:pPr>
+        <w:tabs>
+          <w:tab w:val="num" w:pos="4320"/>
+        </w:tabs>
+        <w:ind w:left="4320" w:hanging="360"/>
+      </w:pPr>
+      <w:rPr>
+        <w:rFonts w:ascii="Wingdings" w:hAnsi="Wingdings" w:hint="default"/>
+        <w:sz w:val="20"/>
+      </w:rPr>
+    </w:lvl>
+    <w:lvl w:ilvl="6" w:tentative="1">
+      <w:start w:val="1"/>
+      <w:numFmt w:val="bullet"/>
+      <w:lvlText w:val=""/>
+      <w:lvlJc w:val="left"/>
+      <w:pPr>
+        <w:tabs>
+          <w:tab w:val="num" w:pos="5040"/>
+        </w:tabs>
+        <w:ind w:left="5040" w:hanging="360"/>
+      </w:pPr>
+      <w:rPr>
+        <w:rFonts w:ascii="Wingdings" w:hAnsi="Wingdings" w:hint="default"/>
+        <w:sz w:val="20"/>
+      </w:rPr>
+    </w:lvl>
+    <w:lvl w:ilvl="7" w:tentative="1">
+      <w:start w:val="1"/>
+      <w:numFmt w:val="bullet"/>
+      <w:lvlText w:val=""/>
+      <w:lvlJc w:val="left"/>
+      <w:pPr>
+        <w:tabs>
+          <w:tab w:val="num" w:pos="5760"/>
+        </w:tabs>
+        <w:ind w:left="5760" w:hanging="360"/>
+      </w:pPr>
+      <w:rPr>
+        <w:rFonts w:ascii="Wingdings" w:hAnsi="Wingdings" w:hint="default"/>
+        <w:sz w:val="20"/>
+      </w:rPr>
+    </w:lvl>
+    <w:lvl w:ilvl="8" w:tentative="1">
+      <w:start w:val="1"/>
+      <w:numFmt w:val="bullet"/>
+      <w:lvlText w:val=""/>
+      <w:lvlJc w:val="left"/>
+      <w:pPr>
+        <w:tabs>
+          <w:tab w:val="num" w:pos="6480"/>
+        </w:tabs>
+        <w:ind w:left="6480" w:hanging="360"/>
+      </w:pPr>
+      <w:rPr>
+        <w:rFonts w:ascii="Wingdings" w:hAnsi="Wingdings" w:hint="default"/>
+        <w:sz w:val="20"/>
+      </w:rPr>
+    </w:lvl>
+  </w:abstractNum>
+  <w:abstractNum w:abstractNumId="10" w15:restartNumberingAfterBreak="0">
     <w:nsid w:val="79C25E60"/>
     <w:multiLevelType w:val="multilevel"/>
     <w:tmpl w:val="98BAA948"/>
@@ -1175,16 +2249,37 @@
     </w:lvl>
   </w:abstractNum>
   <w:num w:numId="1">
+    <w:abstractNumId w:val="8"/>
+  </w:num>
+  <w:num w:numId="2">
+    <w:abstractNumId w:val="10"/>
+  </w:num>
+  <w:num w:numId="3">
+    <w:abstractNumId w:val="6"/>
+  </w:num>
+  <w:num w:numId="4">
+    <w:abstractNumId w:val="4"/>
+  </w:num>
+  <w:num w:numId="5">
+    <w:abstractNumId w:val="0"/>
+  </w:num>
+  <w:num w:numId="6">
+    <w:abstractNumId w:val="9"/>
+  </w:num>
+  <w:num w:numId="7">
+    <w:abstractNumId w:val="7"/>
+  </w:num>
+  <w:num w:numId="8">
     <w:abstractNumId w:val="2"/>
   </w:num>
-  <w:num w:numId="2">
+  <w:num w:numId="9">
+    <w:abstractNumId w:val="5"/>
+  </w:num>
+  <w:num w:numId="10">
     <w:abstractNumId w:val="3"/>
   </w:num>
-  <w:num w:numId="3">
+  <w:num w:numId="11">
     <w:abstractNumId w:val="1"/>
-  </w:num>
-  <w:num w:numId="4">
-    <w:abstractNumId w:val="0"/>
   </w:num>
 </w:numbering>
 </file>
@@ -1708,6 +2803,16 @@
       <w:bCs/>
     </w:rPr>
   </w:style>
+  <w:style w:type="paragraph" w:styleId="ListParagraph">
+    <w:name w:val="List Paragraph"/>
+    <w:basedOn w:val="Normal"/>
+    <w:uiPriority w:val="34"/>
+    <w:qFormat/>
+    <w:rsid w:val="00610338"/>
+    <w:pPr>
+      <w:ind w:leftChars="200" w:left="480"/>
+    </w:pPr>
+  </w:style>
 </w:styles>
 </file>
 

</xml_diff>